<commit_message>
Actualizar el link del QA en el test
</commit_message>
<xml_diff>
--- a/Documentación de testing.docx
+++ b/Documentación de testing.docx
@@ -93,15 +93,7 @@
           <w:sz w:val="26"/>
           <w:szCs w:val="26"/>
         </w:rPr>
-        <w:t xml:space="preserve">GRUPO </w:t>
-      </w:r>
-      <w:r>
-        <w:rPr>
-          <w:rFonts w:ascii="Times New Roman" w:hAnsi="Times New Roman" w:cs="Times New Roman"/>
-          <w:sz w:val="26"/>
-          <w:szCs w:val="26"/>
-        </w:rPr>
-        <w:t xml:space="preserve">3 – </w:t>
+        <w:t xml:space="preserve">GRUPO 3 – </w:t>
       </w:r>
       <w:proofErr w:type="spellStart"/>
       <w:r>
@@ -137,39 +129,7 @@
           <w:sz w:val="26"/>
           <w:szCs w:val="26"/>
         </w:rPr>
-        <w:t>I</w:t>
-      </w:r>
-      <w:r>
-        <w:rPr>
-          <w:rFonts w:ascii="Times New Roman" w:hAnsi="Times New Roman" w:cs="Times New Roman"/>
-          <w:sz w:val="26"/>
-          <w:szCs w:val="26"/>
-        </w:rPr>
-        <w:t>nforme de testeo al grupo</w:t>
-      </w:r>
-      <w:r>
-        <w:rPr>
-          <w:rFonts w:ascii="Times New Roman" w:hAnsi="Times New Roman" w:cs="Times New Roman"/>
-          <w:sz w:val="26"/>
-          <w:szCs w:val="26"/>
-        </w:rPr>
-        <w:t xml:space="preserve"> 2 -</w:t>
-      </w:r>
-      <w:r>
-        <w:rPr>
-          <w:rFonts w:ascii="Times New Roman" w:hAnsi="Times New Roman" w:cs="Times New Roman"/>
-          <w:sz w:val="26"/>
-          <w:szCs w:val="26"/>
-        </w:rPr>
-        <w:t xml:space="preserve"> Universidad Católica Americana</w:t>
-      </w:r>
-      <w:r>
-        <w:rPr>
-          <w:rFonts w:ascii="Times New Roman" w:hAnsi="Times New Roman" w:cs="Times New Roman"/>
-          <w:sz w:val="26"/>
-          <w:szCs w:val="26"/>
-        </w:rPr>
-        <w:t xml:space="preserve"> (UCA)</w:t>
+        <w:t>Informe de testeo al grupo 2 - Universidad Católica Americana (UCA)</w:t>
       </w:r>
     </w:p>
     <w:p>
@@ -357,31 +317,7 @@
           <w:sz w:val="26"/>
           <w:szCs w:val="26"/>
         </w:rPr>
-        <w:t xml:space="preserve">Mery Helen </w:t>
-      </w:r>
-      <w:r>
-        <w:rPr>
-          <w:rFonts w:ascii="Times New Roman" w:hAnsi="Times New Roman" w:cs="Times New Roman"/>
-          <w:sz w:val="26"/>
-          <w:szCs w:val="26"/>
-        </w:rPr>
-        <w:t>Ortiz</w:t>
-      </w:r>
-      <w:r>
-        <w:rPr>
-          <w:rFonts w:ascii="Times New Roman" w:hAnsi="Times New Roman" w:cs="Times New Roman"/>
-          <w:sz w:val="26"/>
-          <w:szCs w:val="26"/>
-        </w:rPr>
-        <w:t xml:space="preserve"> </w:t>
-      </w:r>
-      <w:r>
-        <w:rPr>
-          <w:rFonts w:ascii="Times New Roman" w:hAnsi="Times New Roman" w:cs="Times New Roman"/>
-          <w:sz w:val="26"/>
-          <w:szCs w:val="26"/>
-        </w:rPr>
-        <w:t>Suarez</w:t>
+        <w:t>Mery Helen Ortiz Suarez</w:t>
       </w:r>
     </w:p>
     <w:p>
@@ -550,119 +486,7 @@
           <w:sz w:val="26"/>
           <w:szCs w:val="26"/>
         </w:rPr>
-        <w:t>La aplicación testeada es una plataforma universitaria de chat en tiempo</w:t>
-      </w:r>
-      <w:r>
-        <w:rPr>
-          <w:rFonts w:ascii="Times New Roman" w:hAnsi="Times New Roman" w:cs="Times New Roman"/>
-          <w:sz w:val="26"/>
-          <w:szCs w:val="26"/>
-        </w:rPr>
-        <w:t xml:space="preserve"> </w:t>
-      </w:r>
-      <w:r>
-        <w:rPr>
-          <w:rFonts w:ascii="Times New Roman" w:hAnsi="Times New Roman" w:cs="Times New Roman"/>
-          <w:sz w:val="26"/>
-          <w:szCs w:val="26"/>
-        </w:rPr>
-        <w:t>real de la Universidad Católica Americana, diseñada para conectar</w:t>
-      </w:r>
-      <w:r>
-        <w:rPr>
-          <w:rFonts w:ascii="Times New Roman" w:hAnsi="Times New Roman" w:cs="Times New Roman"/>
-          <w:sz w:val="26"/>
-          <w:szCs w:val="26"/>
-        </w:rPr>
-        <w:t xml:space="preserve"> </w:t>
-      </w:r>
-      <w:r>
-        <w:rPr>
-          <w:rFonts w:ascii="Times New Roman" w:hAnsi="Times New Roman" w:cs="Times New Roman"/>
-          <w:sz w:val="26"/>
-          <w:szCs w:val="26"/>
-        </w:rPr>
-        <w:t>estudiantes con monitores académicos en un entorno 1 a 1, priorizando</w:t>
-      </w:r>
-      <w:r>
-        <w:rPr>
-          <w:rFonts w:ascii="Times New Roman" w:hAnsi="Times New Roman" w:cs="Times New Roman"/>
-          <w:sz w:val="26"/>
-          <w:szCs w:val="26"/>
-        </w:rPr>
-        <w:t xml:space="preserve"> </w:t>
-      </w:r>
-      <w:r>
-        <w:rPr>
-          <w:rFonts w:ascii="Times New Roman" w:hAnsi="Times New Roman" w:cs="Times New Roman"/>
-          <w:sz w:val="26"/>
-          <w:szCs w:val="26"/>
-        </w:rPr>
-        <w:t>la usabilidad en</w:t>
-      </w:r>
-      <w:r>
-        <w:rPr>
-          <w:rFonts w:ascii="Times New Roman" w:hAnsi="Times New Roman" w:cs="Times New Roman"/>
-          <w:sz w:val="26"/>
-          <w:szCs w:val="26"/>
-        </w:rPr>
-        <w:t xml:space="preserve"> </w:t>
-      </w:r>
-      <w:r>
-        <w:rPr>
-          <w:rFonts w:ascii="Times New Roman" w:hAnsi="Times New Roman" w:cs="Times New Roman"/>
-          <w:sz w:val="26"/>
-          <w:szCs w:val="26"/>
-        </w:rPr>
-        <w:t>computadores de escritorio. Cuenta con autenticación</w:t>
-      </w:r>
-      <w:r>
-        <w:rPr>
-          <w:rFonts w:ascii="Times New Roman" w:hAnsi="Times New Roman" w:cs="Times New Roman"/>
-          <w:sz w:val="26"/>
-          <w:szCs w:val="26"/>
-        </w:rPr>
-        <w:t xml:space="preserve"> </w:t>
-      </w:r>
-      <w:r>
-        <w:rPr>
-          <w:rFonts w:ascii="Times New Roman" w:hAnsi="Times New Roman" w:cs="Times New Roman"/>
-          <w:sz w:val="26"/>
-          <w:szCs w:val="26"/>
-        </w:rPr>
-        <w:t>por correo institucional y contraseña, mensajería en tiempo real,</w:t>
-      </w:r>
-      <w:r>
-        <w:rPr>
-          <w:rFonts w:ascii="Times New Roman" w:hAnsi="Times New Roman" w:cs="Times New Roman"/>
-          <w:sz w:val="26"/>
-          <w:szCs w:val="26"/>
-        </w:rPr>
-        <w:t xml:space="preserve"> </w:t>
-      </w:r>
-      <w:r>
-        <w:rPr>
-          <w:rFonts w:ascii="Times New Roman" w:hAnsi="Times New Roman" w:cs="Times New Roman"/>
-          <w:sz w:val="26"/>
-          <w:szCs w:val="26"/>
-        </w:rPr>
-        <w:t>lista de usuarios con indicador de disponibilidad, buscador de contactos</w:t>
-      </w:r>
-      <w:r>
-        <w:rPr>
-          <w:rFonts w:ascii="Times New Roman" w:hAnsi="Times New Roman" w:cs="Times New Roman"/>
-          <w:sz w:val="26"/>
-          <w:szCs w:val="26"/>
-        </w:rPr>
-        <w:t xml:space="preserve"> </w:t>
-      </w:r>
-      <w:r>
-        <w:rPr>
-          <w:rFonts w:ascii="Times New Roman" w:hAnsi="Times New Roman" w:cs="Times New Roman"/>
-          <w:sz w:val="26"/>
-          <w:szCs w:val="26"/>
-        </w:rPr>
-        <w:t>y un módulo de perfil profesional con configuración de notificaciones.</w:t>
+        <w:t>La aplicación testeada es una plataforma universitaria de chat en tiempo real de la Universidad Católica Americana, diseñada para conectar estudiantes con monitores académicos en un entorno 1 a 1, priorizando la usabilidad en computadores de escritorio. Cuenta con autenticación por correo institucional y contraseña, mensajería en tiempo real, lista de usuarios con indicador de disponibilidad, buscador de contactos y un módulo de perfil profesional con configuración de notificaciones.</w:t>
       </w:r>
     </w:p>
     <w:p>
@@ -1372,71 +1196,7 @@
           <w:sz w:val="26"/>
           <w:szCs w:val="26"/>
         </w:rPr>
-        <w:t>El hallazgo más relevante de la aplicación corresponde al sistema de</w:t>
-      </w:r>
-      <w:r>
-        <w:rPr>
-          <w:rFonts w:ascii="Times New Roman" w:hAnsi="Times New Roman" w:cs="Times New Roman"/>
-          <w:sz w:val="26"/>
-          <w:szCs w:val="26"/>
-        </w:rPr>
-        <w:t xml:space="preserve"> </w:t>
-      </w:r>
-      <w:r>
-        <w:rPr>
-          <w:rFonts w:ascii="Times New Roman" w:hAnsi="Times New Roman" w:cs="Times New Roman"/>
-          <w:sz w:val="26"/>
-          <w:szCs w:val="26"/>
-        </w:rPr>
-        <w:t>mensajería en tiempo real, documentado como BUG-01, BUG-02 y BUG-03:</w:t>
-      </w:r>
-      <w:r>
-        <w:rPr>
-          <w:rFonts w:ascii="Times New Roman" w:hAnsi="Times New Roman" w:cs="Times New Roman"/>
-          <w:sz w:val="26"/>
-          <w:szCs w:val="26"/>
-        </w:rPr>
-        <w:t xml:space="preserve"> </w:t>
-      </w:r>
-      <w:r>
-        <w:rPr>
-          <w:rFonts w:ascii="Times New Roman" w:hAnsi="Times New Roman" w:cs="Times New Roman"/>
-          <w:sz w:val="26"/>
-          <w:szCs w:val="26"/>
-        </w:rPr>
-        <w:t>los mensajes no se entregan correctamente al receptor en la mayoría de</w:t>
-      </w:r>
-      <w:r>
-        <w:rPr>
-          <w:rFonts w:ascii="Times New Roman" w:hAnsi="Times New Roman" w:cs="Times New Roman"/>
-          <w:sz w:val="26"/>
-          <w:szCs w:val="26"/>
-        </w:rPr>
-        <w:t xml:space="preserve"> </w:t>
-      </w:r>
-      <w:r>
-        <w:rPr>
-          <w:rFonts w:ascii="Times New Roman" w:hAnsi="Times New Roman" w:cs="Times New Roman"/>
-          <w:sz w:val="26"/>
-          <w:szCs w:val="26"/>
-        </w:rPr>
-        <w:t>los escenarios de uso. Este fallo afecta el flujo principal de la</w:t>
-      </w:r>
-      <w:r>
-        <w:rPr>
-          <w:rFonts w:ascii="Times New Roman" w:hAnsi="Times New Roman" w:cs="Times New Roman"/>
-          <w:sz w:val="26"/>
-          <w:szCs w:val="26"/>
-        </w:rPr>
-        <w:t xml:space="preserve"> </w:t>
-      </w:r>
-      <w:r>
-        <w:rPr>
-          <w:rFonts w:ascii="Times New Roman" w:hAnsi="Times New Roman" w:cs="Times New Roman"/>
-          <w:sz w:val="26"/>
-          <w:szCs w:val="26"/>
-        </w:rPr>
-        <w:t>plataforma, ya que la mensajería entre usuarios es su función central.</w:t>
+        <w:t>El hallazgo más relevante de la aplicación corresponde al sistema de mensajería en tiempo real, documentado como BUG-01, BUG-02 y BUG-03: los mensajes no se entregan correctamente al receptor en la mayoría de los escenarios de uso. Este fallo afecta el flujo principal de la plataforma, ya que la mensajería entre usuarios es su función central.</w:t>
       </w:r>
     </w:p>
     <w:p>
@@ -1454,55 +1214,7 @@
           <w:sz w:val="26"/>
           <w:szCs w:val="26"/>
         </w:rPr>
-        <w:t>De manera específica, se identificó que los mensajes únicamente se</w:t>
-      </w:r>
-      <w:r>
-        <w:rPr>
-          <w:rFonts w:ascii="Times New Roman" w:hAnsi="Times New Roman" w:cs="Times New Roman"/>
-          <w:sz w:val="26"/>
-          <w:szCs w:val="26"/>
-        </w:rPr>
-        <w:t xml:space="preserve"> </w:t>
-      </w:r>
-      <w:r>
-        <w:rPr>
-          <w:rFonts w:ascii="Times New Roman" w:hAnsi="Times New Roman" w:cs="Times New Roman"/>
-          <w:sz w:val="26"/>
-          <w:szCs w:val="26"/>
-        </w:rPr>
-        <w:t>reciben cuando ambos usuarios se encuentran activos dentro del mismo</w:t>
-      </w:r>
-      <w:r>
-        <w:rPr>
-          <w:rFonts w:ascii="Times New Roman" w:hAnsi="Times New Roman" w:cs="Times New Roman"/>
-          <w:sz w:val="26"/>
-          <w:szCs w:val="26"/>
-        </w:rPr>
-        <w:t xml:space="preserve"> </w:t>
-      </w:r>
-      <w:r>
-        <w:rPr>
-          <w:rFonts w:ascii="Times New Roman" w:hAnsi="Times New Roman" w:cs="Times New Roman"/>
-          <w:sz w:val="26"/>
-          <w:szCs w:val="26"/>
-        </w:rPr>
-        <w:t>chat de forma simultánea (BUG-03). Si uno de los usuarios está en otra</w:t>
-      </w:r>
-      <w:r>
-        <w:rPr>
-          <w:rFonts w:ascii="Times New Roman" w:hAnsi="Times New Roman" w:cs="Times New Roman"/>
-          <w:sz w:val="26"/>
-          <w:szCs w:val="26"/>
-        </w:rPr>
-        <w:t xml:space="preserve"> </w:t>
-      </w:r>
-      <w:r>
-        <w:rPr>
-          <w:rFonts w:ascii="Times New Roman" w:hAnsi="Times New Roman" w:cs="Times New Roman"/>
-          <w:sz w:val="26"/>
-          <w:szCs w:val="26"/>
-        </w:rPr>
-        <w:t xml:space="preserve">sección de la aplicación o simplemente </w:t>
+        <w:t xml:space="preserve">De manera específica, se identificó que los mensajes únicamente se reciben cuando ambos usuarios se encuentran activos dentro del mismo chat de forma simultánea (BUG-03). Si uno de los usuarios está en otra sección de la aplicación o simplemente </w:t>
       </w:r>
       <w:proofErr w:type="gramStart"/>
       <w:r>
@@ -1520,55 +1232,7 @@
           <w:sz w:val="26"/>
           <w:szCs w:val="26"/>
         </w:rPr>
-        <w:t xml:space="preserve"> pero fuera del chat</w:t>
-      </w:r>
-      <w:r>
-        <w:rPr>
-          <w:rFonts w:ascii="Times New Roman" w:hAnsi="Times New Roman" w:cs="Times New Roman"/>
-          <w:sz w:val="26"/>
-          <w:szCs w:val="26"/>
-        </w:rPr>
-        <w:t xml:space="preserve"> </w:t>
-      </w:r>
-      <w:r>
-        <w:rPr>
-          <w:rFonts w:ascii="Times New Roman" w:hAnsi="Times New Roman" w:cs="Times New Roman"/>
-          <w:sz w:val="26"/>
-          <w:szCs w:val="26"/>
-        </w:rPr>
-        <w:t>activo, el mensaje no llega, aunque sí se genera la notificación de</w:t>
-      </w:r>
-      <w:r>
-        <w:rPr>
-          <w:rFonts w:ascii="Times New Roman" w:hAnsi="Times New Roman" w:cs="Times New Roman"/>
-          <w:sz w:val="26"/>
-          <w:szCs w:val="26"/>
-        </w:rPr>
-        <w:t xml:space="preserve"> </w:t>
-      </w:r>
-      <w:r>
-        <w:rPr>
-          <w:rFonts w:ascii="Times New Roman" w:hAnsi="Times New Roman" w:cs="Times New Roman"/>
-          <w:sz w:val="26"/>
-          <w:szCs w:val="26"/>
-        </w:rPr>
-        <w:t>nuevo mensaje. Esto indica un problema en la persistencia o el</w:t>
-      </w:r>
-      <w:r>
-        <w:rPr>
-          <w:rFonts w:ascii="Times New Roman" w:hAnsi="Times New Roman" w:cs="Times New Roman"/>
-          <w:sz w:val="26"/>
-          <w:szCs w:val="26"/>
-        </w:rPr>
-        <w:t xml:space="preserve"> </w:t>
-      </w:r>
-      <w:r>
-        <w:rPr>
-          <w:rFonts w:ascii="Times New Roman" w:hAnsi="Times New Roman" w:cs="Times New Roman"/>
-          <w:sz w:val="26"/>
-          <w:szCs w:val="26"/>
-        </w:rPr>
-        <w:t xml:space="preserve">enrutamiento de los mensajes a nivel de </w:t>
+        <w:t xml:space="preserve"> pero fuera del chat activo, el mensaje no llega, aunque sí se genera la notificación de nuevo mensaje. Esto indica un problema en la persistencia o el enrutamiento de los mensajes a nivel de </w:t>
       </w:r>
       <w:proofErr w:type="spellStart"/>
       <w:r>
@@ -1586,23 +1250,7 @@
           <w:sz w:val="26"/>
           <w:szCs w:val="26"/>
         </w:rPr>
-        <w:t>, posiblemente</w:t>
-      </w:r>
-      <w:r>
-        <w:rPr>
-          <w:rFonts w:ascii="Times New Roman" w:hAnsi="Times New Roman" w:cs="Times New Roman"/>
-          <w:sz w:val="26"/>
-          <w:szCs w:val="26"/>
-        </w:rPr>
-        <w:t xml:space="preserve"> </w:t>
-      </w:r>
-      <w:r>
-        <w:rPr>
-          <w:rFonts w:ascii="Times New Roman" w:hAnsi="Times New Roman" w:cs="Times New Roman"/>
-          <w:sz w:val="26"/>
-          <w:szCs w:val="26"/>
-        </w:rPr>
-        <w:t xml:space="preserve">relacionado con la implementación de </w:t>
+        <w:t xml:space="preserve">, posiblemente relacionado con la implementación de </w:t>
       </w:r>
       <w:proofErr w:type="spellStart"/>
       <w:r>
@@ -1620,23 +1268,7 @@
           <w:sz w:val="26"/>
           <w:szCs w:val="26"/>
         </w:rPr>
-        <w:t xml:space="preserve"> o el manejo de eventos</w:t>
-      </w:r>
-      <w:r>
-        <w:rPr>
-          <w:rFonts w:ascii="Times New Roman" w:hAnsi="Times New Roman" w:cs="Times New Roman"/>
-          <w:sz w:val="26"/>
-          <w:szCs w:val="26"/>
-        </w:rPr>
-        <w:t xml:space="preserve"> </w:t>
-      </w:r>
-      <w:r>
-        <w:rPr>
-          <w:rFonts w:ascii="Times New Roman" w:hAnsi="Times New Roman" w:cs="Times New Roman"/>
-          <w:sz w:val="26"/>
-          <w:szCs w:val="26"/>
-        </w:rPr>
-        <w:t>del servidor.</w:t>
+        <w:t xml:space="preserve"> o el manejo de eventos del servidor.</w:t>
       </w:r>
     </w:p>
     <w:p>
@@ -1654,39 +1286,7 @@
           <w:sz w:val="26"/>
           <w:szCs w:val="26"/>
         </w:rPr>
-        <w:t>Adicionalmente, se detectaron múltiples fallos de usabilidad y</w:t>
-      </w:r>
-      <w:r>
-        <w:rPr>
-          <w:rFonts w:ascii="Times New Roman" w:hAnsi="Times New Roman" w:cs="Times New Roman"/>
-          <w:sz w:val="26"/>
-          <w:szCs w:val="26"/>
-        </w:rPr>
-        <w:t xml:space="preserve"> </w:t>
-      </w:r>
-      <w:r>
-        <w:rPr>
-          <w:rFonts w:ascii="Times New Roman" w:hAnsi="Times New Roman" w:cs="Times New Roman"/>
-          <w:sz w:val="26"/>
-          <w:szCs w:val="26"/>
-        </w:rPr>
-        <w:t>validación: ausencia de límite de caracteres en campos de entrada</w:t>
-      </w:r>
-      <w:r>
-        <w:rPr>
-          <w:rFonts w:ascii="Times New Roman" w:hAnsi="Times New Roman" w:cs="Times New Roman"/>
-          <w:sz w:val="26"/>
-          <w:szCs w:val="26"/>
-        </w:rPr>
-        <w:t xml:space="preserve"> </w:t>
-      </w:r>
-      <w:r>
-        <w:rPr>
-          <w:rFonts w:ascii="Times New Roman" w:hAnsi="Times New Roman" w:cs="Times New Roman"/>
-          <w:sz w:val="26"/>
-          <w:szCs w:val="26"/>
-        </w:rPr>
-        <w:t xml:space="preserve">(TC-003, TC-004, TC-006), fallo en el </w:t>
+        <w:t xml:space="preserve">Adicionalmente, se detectaron múltiples fallos de usabilidad y validación: ausencia de límite de caracteres en campos de entrada (TC-003, TC-004, TC-006), fallo en el </w:t>
       </w:r>
       <w:proofErr w:type="spellStart"/>
       <w:r>
@@ -1704,87 +1304,7 @@
           <w:sz w:val="26"/>
           <w:szCs w:val="26"/>
         </w:rPr>
-        <w:t xml:space="preserve"> cuando el correo se escribe</w:t>
-      </w:r>
-      <w:r>
-        <w:rPr>
-          <w:rFonts w:ascii="Times New Roman" w:hAnsi="Times New Roman" w:cs="Times New Roman"/>
-          <w:sz w:val="26"/>
-          <w:szCs w:val="26"/>
-        </w:rPr>
-        <w:t xml:space="preserve"> </w:t>
-      </w:r>
-      <w:r>
-        <w:rPr>
-          <w:rFonts w:ascii="Times New Roman" w:hAnsi="Times New Roman" w:cs="Times New Roman"/>
-          <w:sz w:val="26"/>
-          <w:szCs w:val="26"/>
-        </w:rPr>
-        <w:t>en mayúsculas (TC-045), ventanas emergentes del navegador que bloquean</w:t>
-      </w:r>
-      <w:r>
-        <w:rPr>
-          <w:rFonts w:ascii="Times New Roman" w:hAnsi="Times New Roman" w:cs="Times New Roman"/>
-          <w:sz w:val="26"/>
-          <w:szCs w:val="26"/>
-        </w:rPr>
-        <w:t xml:space="preserve"> </w:t>
-      </w:r>
-      <w:r>
-        <w:rPr>
-          <w:rFonts w:ascii="Times New Roman" w:hAnsi="Times New Roman" w:cs="Times New Roman"/>
-          <w:sz w:val="26"/>
-          <w:szCs w:val="26"/>
-        </w:rPr>
-        <w:t>la interfaz al recibir notificaciones (TC-014), ausencia de indicador</w:t>
-      </w:r>
-      <w:r>
-        <w:rPr>
-          <w:rFonts w:ascii="Times New Roman" w:hAnsi="Times New Roman" w:cs="Times New Roman"/>
-          <w:sz w:val="26"/>
-          <w:szCs w:val="26"/>
-        </w:rPr>
-        <w:t xml:space="preserve"> </w:t>
-      </w:r>
-      <w:r>
-        <w:rPr>
-          <w:rFonts w:ascii="Times New Roman" w:hAnsi="Times New Roman" w:cs="Times New Roman"/>
-          <w:sz w:val="26"/>
-          <w:szCs w:val="26"/>
-        </w:rPr>
-        <w:t>de escritura en tiempo real (TC-015), falta de confirmación de entrega</w:t>
-      </w:r>
-      <w:r>
-        <w:rPr>
-          <w:rFonts w:ascii="Times New Roman" w:hAnsi="Times New Roman" w:cs="Times New Roman"/>
-          <w:sz w:val="26"/>
-          <w:szCs w:val="26"/>
-        </w:rPr>
-        <w:t xml:space="preserve"> </w:t>
-      </w:r>
-      <w:r>
-        <w:rPr>
-          <w:rFonts w:ascii="Times New Roman" w:hAnsi="Times New Roman" w:cs="Times New Roman"/>
-          <w:sz w:val="26"/>
-          <w:szCs w:val="26"/>
-        </w:rPr>
-        <w:t>de mensajes (TC-016), y estado de disponibilidad de usuarios que no se</w:t>
-      </w:r>
-      <w:r>
-        <w:rPr>
-          <w:rFonts w:ascii="Times New Roman" w:hAnsi="Times New Roman" w:cs="Times New Roman"/>
-          <w:sz w:val="26"/>
-          <w:szCs w:val="26"/>
-        </w:rPr>
-        <w:t xml:space="preserve"> </w:t>
-      </w:r>
-      <w:r>
-        <w:rPr>
-          <w:rFonts w:ascii="Times New Roman" w:hAnsi="Times New Roman" w:cs="Times New Roman"/>
-          <w:sz w:val="26"/>
-          <w:szCs w:val="26"/>
-        </w:rPr>
-        <w:t>actualiza correctamente entre sesiones (TC-027).</w:t>
+        <w:t xml:space="preserve"> cuando el correo se escribe en mayúsculas (TC-045), ventanas emergentes del navegador que bloquean la interfaz al recibir notificaciones (TC-014), ausencia de indicador de escritura en tiempo real (TC-015), falta de confirmación de entrega de mensajes (TC-016), y estado de disponibilidad de usuarios que no se actualiza correctamente entre sesiones (TC-027).</w:t>
       </w:r>
     </w:p>
     <w:p>
@@ -1874,87 +1394,7 @@
           <w:sz w:val="26"/>
           <w:szCs w:val="26"/>
         </w:rPr>
-        <w:t xml:space="preserve"> con correo y contraseña, incluyendo</w:t>
-      </w:r>
-      <w:r>
-        <w:rPr>
-          <w:rFonts w:ascii="Times New Roman" w:hAnsi="Times New Roman" w:cs="Times New Roman"/>
-          <w:sz w:val="26"/>
-          <w:szCs w:val="26"/>
-        </w:rPr>
-        <w:t xml:space="preserve"> </w:t>
-      </w:r>
-      <w:r>
-        <w:rPr>
-          <w:rFonts w:ascii="Times New Roman" w:hAnsi="Times New Roman" w:cs="Times New Roman"/>
-          <w:sz w:val="26"/>
-          <w:szCs w:val="26"/>
-        </w:rPr>
-        <w:t>validaciones de campos vacíos, correos en mayúsculas, espacios al</w:t>
-      </w:r>
-      <w:r>
-        <w:rPr>
-          <w:rFonts w:ascii="Times New Roman" w:hAnsi="Times New Roman" w:cs="Times New Roman"/>
-          <w:sz w:val="26"/>
-          <w:szCs w:val="26"/>
-        </w:rPr>
-        <w:t xml:space="preserve"> </w:t>
-      </w:r>
-      <w:r>
-        <w:rPr>
-          <w:rFonts w:ascii="Times New Roman" w:hAnsi="Times New Roman" w:cs="Times New Roman"/>
-          <w:sz w:val="26"/>
-          <w:szCs w:val="26"/>
-        </w:rPr>
-        <w:t>inicio y al final, y doble clic en el botón de inicio de sesión. La</w:t>
-      </w:r>
-      <w:r>
-        <w:rPr>
-          <w:rFonts w:ascii="Times New Roman" w:hAnsi="Times New Roman" w:cs="Times New Roman"/>
-          <w:sz w:val="26"/>
-          <w:szCs w:val="26"/>
-        </w:rPr>
-        <w:t xml:space="preserve"> </w:t>
-      </w:r>
-      <w:r>
-        <w:rPr>
-          <w:rFonts w:ascii="Times New Roman" w:hAnsi="Times New Roman" w:cs="Times New Roman"/>
-          <w:sz w:val="26"/>
-          <w:szCs w:val="26"/>
-        </w:rPr>
-        <w:t>mayoría de las validaciones funciona correctamente; sin embargo, el</w:t>
-      </w:r>
-      <w:r>
-        <w:rPr>
-          <w:rFonts w:ascii="Times New Roman" w:hAnsi="Times New Roman" w:cs="Times New Roman"/>
-          <w:sz w:val="26"/>
-          <w:szCs w:val="26"/>
-        </w:rPr>
-        <w:t xml:space="preserve"> </w:t>
-      </w:r>
-      <w:r>
-        <w:rPr>
-          <w:rFonts w:ascii="Times New Roman" w:hAnsi="Times New Roman" w:cs="Times New Roman"/>
-          <w:sz w:val="26"/>
-          <w:szCs w:val="26"/>
-        </w:rPr>
-        <w:t>sistema rechaza el correo cuando se escribe en mayúsculas, lo que</w:t>
-      </w:r>
-      <w:r>
-        <w:rPr>
-          <w:rFonts w:ascii="Times New Roman" w:hAnsi="Times New Roman" w:cs="Times New Roman"/>
-          <w:sz w:val="26"/>
-          <w:szCs w:val="26"/>
-        </w:rPr>
-        <w:t xml:space="preserve"> </w:t>
-      </w:r>
-      <w:r>
-        <w:rPr>
-          <w:rFonts w:ascii="Times New Roman" w:hAnsi="Times New Roman" w:cs="Times New Roman"/>
-          <w:sz w:val="26"/>
-          <w:szCs w:val="26"/>
-        </w:rPr>
-        <w:t>representa un comportamiento no estándar que debe corregirse.</w:t>
+        <w:t xml:space="preserve"> con correo y contraseña, incluyendo validaciones de campos vacíos, correos en mayúsculas, espacios al inicio y al final, y doble clic en el botón de inicio de sesión. La mayoría de las validaciones funciona correctamente; sin embargo, el sistema rechaza el correo cuando se escribe en mayúsculas, lo que representa un comportamiento no estándar que debe corregirse.</w:t>
       </w:r>
     </w:p>
     <w:p>
@@ -2000,87 +1440,7 @@
           <w:sz w:val="26"/>
           <w:szCs w:val="26"/>
         </w:rPr>
-        <w:t>Se verificó el envío y recepción de mensajes entre usuarios conectados.</w:t>
-      </w:r>
-      <w:r>
-        <w:rPr>
-          <w:rFonts w:ascii="Times New Roman" w:hAnsi="Times New Roman" w:cs="Times New Roman"/>
-          <w:sz w:val="26"/>
-          <w:szCs w:val="26"/>
-        </w:rPr>
-        <w:t xml:space="preserve"> </w:t>
-      </w:r>
-      <w:r>
-        <w:rPr>
-          <w:rFonts w:ascii="Times New Roman" w:hAnsi="Times New Roman" w:cs="Times New Roman"/>
-          <w:sz w:val="26"/>
-          <w:szCs w:val="26"/>
-        </w:rPr>
-        <w:t>El botón de enviar y la tecla Enter funcionan correctamente cuando ambos</w:t>
-      </w:r>
-      <w:r>
-        <w:rPr>
-          <w:rFonts w:ascii="Times New Roman" w:hAnsi="Times New Roman" w:cs="Times New Roman"/>
-          <w:sz w:val="26"/>
-          <w:szCs w:val="26"/>
-        </w:rPr>
-        <w:t xml:space="preserve"> </w:t>
-      </w:r>
-      <w:r>
-        <w:rPr>
-          <w:rFonts w:ascii="Times New Roman" w:hAnsi="Times New Roman" w:cs="Times New Roman"/>
-          <w:sz w:val="26"/>
-          <w:szCs w:val="26"/>
-        </w:rPr>
-        <w:t>usuarios están en el mismo chat de forma simultánea. No obstante, los</w:t>
-      </w:r>
-      <w:r>
-        <w:rPr>
-          <w:rFonts w:ascii="Times New Roman" w:hAnsi="Times New Roman" w:cs="Times New Roman"/>
-          <w:sz w:val="26"/>
-          <w:szCs w:val="26"/>
-        </w:rPr>
-        <w:t xml:space="preserve"> </w:t>
-      </w:r>
-      <w:r>
-        <w:rPr>
-          <w:rFonts w:ascii="Times New Roman" w:hAnsi="Times New Roman" w:cs="Times New Roman"/>
-          <w:sz w:val="26"/>
-          <w:szCs w:val="26"/>
-        </w:rPr>
-        <w:t>mensajes no se entregan cuando el receptor no está activo dentro del</w:t>
-      </w:r>
-      <w:r>
-        <w:rPr>
-          <w:rFonts w:ascii="Times New Roman" w:hAnsi="Times New Roman" w:cs="Times New Roman"/>
-          <w:sz w:val="26"/>
-          <w:szCs w:val="26"/>
-        </w:rPr>
-        <w:t xml:space="preserve"> </w:t>
-      </w:r>
-      <w:r>
-        <w:rPr>
-          <w:rFonts w:ascii="Times New Roman" w:hAnsi="Times New Roman" w:cs="Times New Roman"/>
-          <w:sz w:val="26"/>
-          <w:szCs w:val="26"/>
-        </w:rPr>
-        <w:t>chat en el mismo momento, lo cual constituye el bug de mayor impacto</w:t>
-      </w:r>
-      <w:r>
-        <w:rPr>
-          <w:rFonts w:ascii="Times New Roman" w:hAnsi="Times New Roman" w:cs="Times New Roman"/>
-          <w:sz w:val="26"/>
-          <w:szCs w:val="26"/>
-        </w:rPr>
-        <w:t xml:space="preserve"> </w:t>
-      </w:r>
-      <w:r>
-        <w:rPr>
-          <w:rFonts w:ascii="Times New Roman" w:hAnsi="Times New Roman" w:cs="Times New Roman"/>
-          <w:sz w:val="26"/>
-          <w:szCs w:val="26"/>
-        </w:rPr>
-        <w:t>funcional de la aplicación.</w:t>
+        <w:t>Se verificó el envío y recepción de mensajes entre usuarios conectados. El botón de enviar y la tecla Enter funcionan correctamente cuando ambos usuarios están en el mismo chat de forma simultánea. No obstante, los mensajes no se entregan cuando el receptor no está activo dentro del chat en el mismo momento, lo cual constituye el bug de mayor impacto funcional de la aplicación.</w:t>
       </w:r>
     </w:p>
     <w:p>
@@ -2126,87 +1486,7 @@
           <w:sz w:val="26"/>
           <w:szCs w:val="26"/>
         </w:rPr>
-        <w:t>Se probó el módulo de perfil profesional incluyendo cambio de nombre,</w:t>
-      </w:r>
-      <w:r>
-        <w:rPr>
-          <w:rFonts w:ascii="Times New Roman" w:hAnsi="Times New Roman" w:cs="Times New Roman"/>
-          <w:sz w:val="26"/>
-          <w:szCs w:val="26"/>
-        </w:rPr>
-        <w:t xml:space="preserve"> </w:t>
-      </w:r>
-      <w:r>
-        <w:rPr>
-          <w:rFonts w:ascii="Times New Roman" w:hAnsi="Times New Roman" w:cs="Times New Roman"/>
-          <w:sz w:val="26"/>
-          <w:szCs w:val="26"/>
-        </w:rPr>
-        <w:t>unidad académica, y configuración de notificaciones. La mayoría de las</w:t>
-      </w:r>
-      <w:r>
-        <w:rPr>
-          <w:rFonts w:ascii="Times New Roman" w:hAnsi="Times New Roman" w:cs="Times New Roman"/>
-          <w:sz w:val="26"/>
-          <w:szCs w:val="26"/>
-        </w:rPr>
-        <w:t xml:space="preserve"> </w:t>
-      </w:r>
-      <w:r>
-        <w:rPr>
-          <w:rFonts w:ascii="Times New Roman" w:hAnsi="Times New Roman" w:cs="Times New Roman"/>
-          <w:sz w:val="26"/>
-          <w:szCs w:val="26"/>
-        </w:rPr>
-        <w:t>validaciones funcionan correctamente: se bloquea el guardado con campos</w:t>
-      </w:r>
-      <w:r>
-        <w:rPr>
-          <w:rFonts w:ascii="Times New Roman" w:hAnsi="Times New Roman" w:cs="Times New Roman"/>
-          <w:sz w:val="26"/>
-          <w:szCs w:val="26"/>
-        </w:rPr>
-        <w:t xml:space="preserve"> </w:t>
-      </w:r>
-      <w:r>
-        <w:rPr>
-          <w:rFonts w:ascii="Times New Roman" w:hAnsi="Times New Roman" w:cs="Times New Roman"/>
-          <w:sz w:val="26"/>
-          <w:szCs w:val="26"/>
-        </w:rPr>
-        <w:t>vacíos, con caracteres especiales en el nombre y con textos que superan</w:t>
-      </w:r>
-      <w:r>
-        <w:rPr>
-          <w:rFonts w:ascii="Times New Roman" w:hAnsi="Times New Roman" w:cs="Times New Roman"/>
-          <w:sz w:val="26"/>
-          <w:szCs w:val="26"/>
-        </w:rPr>
-        <w:t xml:space="preserve"> </w:t>
-      </w:r>
-      <w:r>
-        <w:rPr>
-          <w:rFonts w:ascii="Times New Roman" w:hAnsi="Times New Roman" w:cs="Times New Roman"/>
-          <w:sz w:val="26"/>
-          <w:szCs w:val="26"/>
-        </w:rPr>
-        <w:t>los límites establecidos. Se identificó que el campo de unidad académica</w:t>
-      </w:r>
-      <w:r>
-        <w:rPr>
-          <w:rFonts w:ascii="Times New Roman" w:hAnsi="Times New Roman" w:cs="Times New Roman"/>
-          <w:sz w:val="26"/>
-          <w:szCs w:val="26"/>
-        </w:rPr>
-        <w:t xml:space="preserve"> </w:t>
-      </w:r>
-      <w:r>
-        <w:rPr>
-          <w:rFonts w:ascii="Times New Roman" w:hAnsi="Times New Roman" w:cs="Times New Roman"/>
-          <w:sz w:val="26"/>
-          <w:szCs w:val="26"/>
-        </w:rPr>
-        <w:t>acepta números y caracteres especiales sin mostrar error.</w:t>
+        <w:t>Se probó el módulo de perfil profesional incluyendo cambio de nombre, unidad académica, y configuración de notificaciones. La mayoría de las validaciones funcionan correctamente: se bloquea el guardado con campos vacíos, con caracteres especiales en el nombre y con textos que superan los límites establecidos. Se identificó que el campo de unidad académica acepta números y caracteres especiales sin mostrar error.</w:t>
       </w:r>
     </w:p>
     <w:p>
@@ -2253,103 +1533,7 @@
           <w:szCs w:val="26"/>
         </w:rPr>
         <w:lastRenderedPageBreak/>
-        <w:t>La aplicación cuenta con una navegación intuitiva y un diseño visual</w:t>
-      </w:r>
-      <w:r>
-        <w:rPr>
-          <w:rFonts w:ascii="Times New Roman" w:hAnsi="Times New Roman" w:cs="Times New Roman"/>
-          <w:sz w:val="26"/>
-          <w:szCs w:val="26"/>
-        </w:rPr>
-        <w:t xml:space="preserve"> </w:t>
-      </w:r>
-      <w:r>
-        <w:rPr>
-          <w:rFonts w:ascii="Times New Roman" w:hAnsi="Times New Roman" w:cs="Times New Roman"/>
-          <w:sz w:val="26"/>
-          <w:szCs w:val="26"/>
-        </w:rPr>
-        <w:t>consistente. Se identificaron oportunidades de mejora en la experiencia</w:t>
-      </w:r>
-      <w:r>
-        <w:rPr>
-          <w:rFonts w:ascii="Times New Roman" w:hAnsi="Times New Roman" w:cs="Times New Roman"/>
-          <w:sz w:val="26"/>
-          <w:szCs w:val="26"/>
-        </w:rPr>
-        <w:t xml:space="preserve"> </w:t>
-      </w:r>
-      <w:r>
-        <w:rPr>
-          <w:rFonts w:ascii="Times New Roman" w:hAnsi="Times New Roman" w:cs="Times New Roman"/>
-          <w:sz w:val="26"/>
-          <w:szCs w:val="26"/>
-        </w:rPr>
-        <w:t>de</w:t>
-      </w:r>
-      <w:r>
-        <w:rPr>
-          <w:rFonts w:ascii="Times New Roman" w:hAnsi="Times New Roman" w:cs="Times New Roman"/>
-          <w:sz w:val="26"/>
-          <w:szCs w:val="26"/>
-        </w:rPr>
-        <w:t xml:space="preserve"> </w:t>
-      </w:r>
-      <w:r>
-        <w:rPr>
-          <w:rFonts w:ascii="Times New Roman" w:hAnsi="Times New Roman" w:cs="Times New Roman"/>
-          <w:sz w:val="26"/>
-          <w:szCs w:val="26"/>
-        </w:rPr>
-        <w:t>usuario: ausencia de contador de caracteres en el campo de mensaje,</w:t>
-      </w:r>
-      <w:r>
-        <w:rPr>
-          <w:rFonts w:ascii="Times New Roman" w:hAnsi="Times New Roman" w:cs="Times New Roman"/>
-          <w:sz w:val="26"/>
-          <w:szCs w:val="26"/>
-        </w:rPr>
-        <w:t xml:space="preserve"> </w:t>
-      </w:r>
-      <w:r>
-        <w:rPr>
-          <w:rFonts w:ascii="Times New Roman" w:hAnsi="Times New Roman" w:cs="Times New Roman"/>
-          <w:sz w:val="26"/>
-          <w:szCs w:val="26"/>
-        </w:rPr>
-        <w:t>falta de indicador de escritura en tiempo real, ausencia de confirmación</w:t>
-      </w:r>
-      <w:r>
-        <w:rPr>
-          <w:rFonts w:ascii="Times New Roman" w:hAnsi="Times New Roman" w:cs="Times New Roman"/>
-          <w:sz w:val="26"/>
-          <w:szCs w:val="26"/>
-        </w:rPr>
-        <w:t xml:space="preserve"> </w:t>
-      </w:r>
-      <w:r>
-        <w:rPr>
-          <w:rFonts w:ascii="Times New Roman" w:hAnsi="Times New Roman" w:cs="Times New Roman"/>
-          <w:sz w:val="26"/>
-          <w:szCs w:val="26"/>
-        </w:rPr>
-        <w:t>de entrega de mensajes, y una lista de usuarios en línea que no refleja</w:t>
-      </w:r>
-      <w:r>
-        <w:rPr>
-          <w:rFonts w:ascii="Times New Roman" w:hAnsi="Times New Roman" w:cs="Times New Roman"/>
-          <w:sz w:val="26"/>
-          <w:szCs w:val="26"/>
-        </w:rPr>
-        <w:t xml:space="preserve"> </w:t>
-      </w:r>
-      <w:r>
-        <w:rPr>
-          <w:rFonts w:ascii="Times New Roman" w:hAnsi="Times New Roman" w:cs="Times New Roman"/>
-          <w:sz w:val="26"/>
-          <w:szCs w:val="26"/>
-        </w:rPr>
-        <w:t>el estado real de disponibilidad entre sesiones activas.</w:t>
+        <w:t>La aplicación cuenta con una navegación intuitiva y un diseño visual consistente. Se identificaron oportunidades de mejora en la experiencia de usuario: ausencia de contador de caracteres en el campo de mensaje, falta de indicador de escritura en tiempo real, ausencia de confirmación de entrega de mensajes, y una lista de usuarios en línea que no refleja el estado real de disponibilidad entre sesiones activas.</w:t>
       </w:r>
     </w:p>
     <w:p>
@@ -2367,71 +1551,7 @@
           <w:sz w:val="26"/>
           <w:szCs w:val="26"/>
         </w:rPr>
-        <w:t>La aplicación presenta una base funcional sólida en los módulos de</w:t>
-      </w:r>
-      <w:r>
-        <w:rPr>
-          <w:rFonts w:ascii="Times New Roman" w:hAnsi="Times New Roman" w:cs="Times New Roman"/>
-          <w:sz w:val="26"/>
-          <w:szCs w:val="26"/>
-        </w:rPr>
-        <w:t xml:space="preserve"> </w:t>
-      </w:r>
-      <w:r>
-        <w:rPr>
-          <w:rFonts w:ascii="Times New Roman" w:hAnsi="Times New Roman" w:cs="Times New Roman"/>
-          <w:sz w:val="26"/>
-          <w:szCs w:val="26"/>
-        </w:rPr>
-        <w:t>autenticación, perfil y navegación general. Sin embargo, el fallo en la</w:t>
-      </w:r>
-      <w:r>
-        <w:rPr>
-          <w:rFonts w:ascii="Times New Roman" w:hAnsi="Times New Roman" w:cs="Times New Roman"/>
-          <w:sz w:val="26"/>
-          <w:szCs w:val="26"/>
-        </w:rPr>
-        <w:t xml:space="preserve"> </w:t>
-      </w:r>
-      <w:r>
-        <w:rPr>
-          <w:rFonts w:ascii="Times New Roman" w:hAnsi="Times New Roman" w:cs="Times New Roman"/>
-          <w:sz w:val="26"/>
-          <w:szCs w:val="26"/>
-        </w:rPr>
-        <w:t>entrega de mensajes fuera del contexto de chat simultáneo impide</w:t>
-      </w:r>
-      <w:r>
-        <w:rPr>
-          <w:rFonts w:ascii="Times New Roman" w:hAnsi="Times New Roman" w:cs="Times New Roman"/>
-          <w:sz w:val="26"/>
-          <w:szCs w:val="26"/>
-        </w:rPr>
-        <w:t xml:space="preserve"> </w:t>
-      </w:r>
-      <w:r>
-        <w:rPr>
-          <w:rFonts w:ascii="Times New Roman" w:hAnsi="Times New Roman" w:cs="Times New Roman"/>
-          <w:sz w:val="26"/>
-          <w:szCs w:val="26"/>
-        </w:rPr>
-        <w:t>considerarla estable para un despliegue, ya que compromete directamente</w:t>
-      </w:r>
-      <w:r>
-        <w:rPr>
-          <w:rFonts w:ascii="Times New Roman" w:hAnsi="Times New Roman" w:cs="Times New Roman"/>
-          <w:sz w:val="26"/>
-          <w:szCs w:val="26"/>
-        </w:rPr>
-        <w:t xml:space="preserve"> </w:t>
-      </w:r>
-      <w:r>
-        <w:rPr>
-          <w:rFonts w:ascii="Times New Roman" w:hAnsi="Times New Roman" w:cs="Times New Roman"/>
-          <w:sz w:val="26"/>
-          <w:szCs w:val="26"/>
-        </w:rPr>
-        <w:t>la función principal de la plataforma.</w:t>
+        <w:t>La aplicación presenta una base funcional sólida en los módulos de autenticación, perfil y navegación general. Sin embargo, el fallo en la entrega de mensajes fuera del contexto de chat simultáneo impide considerarla estable para un despliegue, ya que compromete directamente la función principal de la plataforma.</w:t>
       </w:r>
     </w:p>
     <w:p>
@@ -2510,15 +1630,7 @@
           <w:sz w:val="26"/>
           <w:szCs w:val="26"/>
         </w:rPr>
-        <w:t xml:space="preserve">Plan de Pruebas - </w:t>
-      </w:r>
-      <w:r>
-        <w:rPr>
-          <w:rFonts w:ascii="Times New Roman" w:hAnsi="Times New Roman" w:cs="Times New Roman"/>
-          <w:sz w:val="26"/>
-          <w:szCs w:val="26"/>
-        </w:rPr>
-        <w:t>Universidad Católica Americana (UCA)</w:t>
+        <w:t>Plan de Pruebas - Universidad Católica Americana (UCA)</w:t>
       </w:r>
     </w:p>
     <w:p>
@@ -2537,6 +1649,44 @@
         </w:rPr>
         <w:t>De 48 casos ejecutados: 30 Aprobados / 18 fallidos</w:t>
       </w:r>
+    </w:p>
+    <w:p>
+      <w:pPr>
+        <w:rPr>
+          <w:rFonts w:ascii="Times New Roman" w:hAnsi="Times New Roman" w:cs="Times New Roman"/>
+          <w:sz w:val="26"/>
+          <w:szCs w:val="26"/>
+        </w:rPr>
+      </w:pPr>
+      <w:hyperlink r:id="rId5" w:history="1">
+        <w:r>
+          <w:rPr>
+            <w:rStyle w:val="Hipervnculo"/>
+            <w:rFonts w:ascii="Times New Roman" w:hAnsi="Times New Roman" w:cs="Times New Roman"/>
+            <w:sz w:val="26"/>
+            <w:szCs w:val="26"/>
+          </w:rPr>
+          <w:t>https://docs.google.c</w:t>
+        </w:r>
+        <w:r>
+          <w:rPr>
+            <w:rStyle w:val="Hipervnculo"/>
+            <w:rFonts w:ascii="Times New Roman" w:hAnsi="Times New Roman" w:cs="Times New Roman"/>
+            <w:sz w:val="26"/>
+            <w:szCs w:val="26"/>
+          </w:rPr>
+          <w:t>o</w:t>
+        </w:r>
+        <w:r>
+          <w:rPr>
+            <w:rStyle w:val="Hipervnculo"/>
+            <w:rFonts w:ascii="Times New Roman" w:hAnsi="Times New Roman" w:cs="Times New Roman"/>
+            <w:sz w:val="26"/>
+            <w:szCs w:val="26"/>
+          </w:rPr>
+          <w:t>m/spreadsheets/d/1erL_r71KtFG7gCttYbeRXvkg-i5-roZ7vPfGd9S3ICo/edit?usp=sharing</w:t>
+        </w:r>
+      </w:hyperlink>
     </w:p>
     <w:tbl>
       <w:tblPr>
@@ -4839,6 +3989,7 @@
                 <w:szCs w:val="26"/>
                 <w:lang w:eastAsia="es-CO"/>
               </w:rPr>
+              <w:lastRenderedPageBreak/>
               <w:t>Diseño</w:t>
             </w:r>
           </w:p>
@@ -4955,7 +4106,6 @@
                 <w:szCs w:val="26"/>
                 <w:lang w:eastAsia="es-CO"/>
               </w:rPr>
-              <w:lastRenderedPageBreak/>
               <w:t>Diseño</w:t>
             </w:r>
           </w:p>
@@ -7119,6 +6269,7 @@
                 <w:szCs w:val="26"/>
                 <w:lang w:eastAsia="es-CO"/>
               </w:rPr>
+              <w:lastRenderedPageBreak/>
               <w:t>Boton</w:t>
             </w:r>
             <w:proofErr w:type="spellEnd"/>
@@ -7266,7 +6417,6 @@
                 <w:szCs w:val="26"/>
                 <w:lang w:eastAsia="es-CO"/>
               </w:rPr>
-              <w:lastRenderedPageBreak/>
               <w:t>Sidebar</w:t>
             </w:r>
             <w:proofErr w:type="spellEnd"/>
@@ -9366,6 +8516,7 @@
                 <w:szCs w:val="26"/>
                 <w:lang w:eastAsia="es-CO"/>
               </w:rPr>
+              <w:lastRenderedPageBreak/>
               <w:t xml:space="preserve">Login con doble clic en el iniciar </w:t>
             </w:r>
             <w:proofErr w:type="spellStart"/>
@@ -9412,16 +8563,7 @@
                 <w:szCs w:val="26"/>
                 <w:lang w:eastAsia="es-CO"/>
               </w:rPr>
-              <w:t>Validación</w:t>
-            </w:r>
-            <w:r>
-              <w:rPr>
-                <w:rFonts w:ascii="Times New Roman" w:eastAsia="Times New Roman" w:hAnsi="Times New Roman" w:cs="Times New Roman"/>
-                <w:sz w:val="26"/>
-                <w:szCs w:val="26"/>
-                <w:lang w:eastAsia="es-CO"/>
-              </w:rPr>
-              <w:t xml:space="preserve"> que ingrese al chat</w:t>
+              <w:t>Validación que ingrese al chat</w:t>
             </w:r>
           </w:p>
         </w:tc>
@@ -9532,15 +8674,7 @@
           <w:sz w:val="26"/>
           <w:szCs w:val="26"/>
         </w:rPr>
-        <w:t>C</w:t>
-      </w:r>
-      <w:r>
-        <w:rPr>
-          <w:rFonts w:ascii="Times New Roman" w:hAnsi="Times New Roman" w:cs="Times New Roman"/>
-          <w:sz w:val="26"/>
-          <w:szCs w:val="26"/>
-        </w:rPr>
-        <w:t>apturas de pantalla</w:t>
+        <w:t>Capturas de pantalla</w:t>
       </w:r>
     </w:p>
     <w:p>
@@ -9558,15 +8692,7 @@
           <w:sz w:val="26"/>
           <w:szCs w:val="26"/>
         </w:rPr>
-        <w:t xml:space="preserve"> A continuación, se mostrarán capturas de pantalla de la aplicación </w:t>
-      </w:r>
-      <w:r>
-        <w:rPr>
-          <w:rFonts w:ascii="Times New Roman" w:hAnsi="Times New Roman" w:cs="Times New Roman"/>
-          <w:sz w:val="26"/>
-          <w:szCs w:val="26"/>
-        </w:rPr>
-        <w:t>donde se mostrará algunos de los casos de prueba</w:t>
+        <w:t xml:space="preserve"> A continuación, se mostrarán capturas de pantalla de la aplicación donde se mostrará algunos de los casos de prueba</w:t>
       </w:r>
     </w:p>
     <w:p>
@@ -9612,6 +8738,7 @@
       <w:r>
         <w:rPr>
           <w:rFonts w:ascii="Times New Roman" w:hAnsi="Times New Roman" w:cs="Times New Roman"/>
+          <w:noProof/>
           <w:sz w:val="26"/>
           <w:szCs w:val="26"/>
         </w:rPr>
@@ -9639,7 +8766,7 @@
                     <pic:cNvPicPr/>
                   </pic:nvPicPr>
                   <pic:blipFill>
-                    <a:blip r:embed="rId5" cstate="print">
+                    <a:blip r:embed="rId6" cstate="print">
                       <a:extLst>
                         <a:ext uri="{28A0092B-C50C-407E-A947-70E740481C1C}">
                           <a14:useLocalDpi xmlns:a14="http://schemas.microsoft.com/office/drawing/2010/main" val="0"/>
@@ -9674,6 +8801,7 @@
       <w:r>
         <w:rPr>
           <w:rFonts w:ascii="Times New Roman" w:hAnsi="Times New Roman" w:cs="Times New Roman"/>
+          <w:noProof/>
           <w:sz w:val="26"/>
           <w:szCs w:val="26"/>
         </w:rPr>
@@ -9693,7 +8821,7 @@
                     <pic:cNvPicPr/>
                   </pic:nvPicPr>
                   <pic:blipFill>
-                    <a:blip r:embed="rId6"/>
+                    <a:blip r:embed="rId7"/>
                     <a:stretch>
                       <a:fillRect/>
                     </a:stretch>
@@ -9811,6 +8939,7 @@
       <w:r>
         <w:rPr>
           <w:rFonts w:ascii="Times New Roman" w:hAnsi="Times New Roman" w:cs="Times New Roman"/>
+          <w:noProof/>
           <w:sz w:val="26"/>
           <w:szCs w:val="26"/>
         </w:rPr>
@@ -9830,7 +8959,7 @@
                     <pic:cNvPicPr/>
                   </pic:nvPicPr>
                   <pic:blipFill>
-                    <a:blip r:embed="rId7"/>
+                    <a:blip r:embed="rId8"/>
                     <a:stretch>
                       <a:fillRect/>
                     </a:stretch>
@@ -9862,6 +8991,7 @@
       <w:r>
         <w:rPr>
           <w:rFonts w:ascii="Times New Roman" w:hAnsi="Times New Roman" w:cs="Times New Roman"/>
+          <w:noProof/>
           <w:sz w:val="26"/>
           <w:szCs w:val="26"/>
         </w:rPr>
@@ -9881,7 +9011,7 @@
                     <pic:cNvPicPr/>
                   </pic:nvPicPr>
                   <pic:blipFill>
-                    <a:blip r:embed="rId8"/>
+                    <a:blip r:embed="rId9"/>
                     <a:stretch>
                       <a:fillRect/>
                     </a:stretch>
@@ -9913,6 +9043,7 @@
       <w:r>
         <w:rPr>
           <w:rFonts w:ascii="Times New Roman" w:hAnsi="Times New Roman" w:cs="Times New Roman"/>
+          <w:noProof/>
           <w:sz w:val="26"/>
           <w:szCs w:val="26"/>
         </w:rPr>
@@ -9932,7 +9063,7 @@
                     <pic:cNvPicPr/>
                   </pic:nvPicPr>
                   <pic:blipFill>
-                    <a:blip r:embed="rId9"/>
+                    <a:blip r:embed="rId10"/>
                     <a:stretch>
                       <a:fillRect/>
                     </a:stretch>
@@ -10021,6 +9152,7 @@
       <w:r>
         <w:rPr>
           <w:rFonts w:ascii="Times New Roman" w:hAnsi="Times New Roman" w:cs="Times New Roman"/>
+          <w:noProof/>
           <w:sz w:val="26"/>
           <w:szCs w:val="26"/>
         </w:rPr>
@@ -10040,7 +9172,7 @@
                     <pic:cNvPicPr/>
                   </pic:nvPicPr>
                   <pic:blipFill>
-                    <a:blip r:embed="rId10"/>
+                    <a:blip r:embed="rId11"/>
                     <a:stretch>
                       <a:fillRect/>
                     </a:stretch>
@@ -10099,6 +9231,7 @@
       <w:r>
         <w:rPr>
           <w:rFonts w:ascii="Times New Roman" w:hAnsi="Times New Roman" w:cs="Times New Roman"/>
+          <w:noProof/>
           <w:sz w:val="26"/>
           <w:szCs w:val="26"/>
         </w:rPr>
@@ -10118,7 +9251,7 @@
                     <pic:cNvPicPr/>
                   </pic:nvPicPr>
                   <pic:blipFill>
-                    <a:blip r:embed="rId11"/>
+                    <a:blip r:embed="rId12"/>
                     <a:stretch>
                       <a:fillRect/>
                     </a:stretch>
@@ -10200,6 +9333,7 @@
       <w:r>
         <w:rPr>
           <w:rFonts w:ascii="Times New Roman" w:hAnsi="Times New Roman" w:cs="Times New Roman"/>
+          <w:noProof/>
           <w:sz w:val="26"/>
           <w:szCs w:val="26"/>
         </w:rPr>
@@ -10219,7 +9353,7 @@
                     <pic:cNvPicPr/>
                   </pic:nvPicPr>
                   <pic:blipFill>
-                    <a:blip r:embed="rId12"/>
+                    <a:blip r:embed="rId13"/>
                     <a:stretch>
                       <a:fillRect/>
                     </a:stretch>
@@ -10272,7 +9406,7 @@
                     </pic:cNvPicPr>
                   </pic:nvPicPr>
                   <pic:blipFill>
-                    <a:blip r:embed="rId13" cstate="print">
+                    <a:blip r:embed="rId14" cstate="print">
                       <a:extLst>
                         <a:ext uri="{28A0092B-C50C-407E-A947-70E740481C1C}">
                           <a14:useLocalDpi xmlns:a14="http://schemas.microsoft.com/office/drawing/2010/main" val="0"/>
@@ -10368,6 +9502,7 @@
       <w:r>
         <w:rPr>
           <w:rFonts w:ascii="Times New Roman" w:hAnsi="Times New Roman" w:cs="Times New Roman"/>
+          <w:noProof/>
           <w:sz w:val="26"/>
           <w:szCs w:val="26"/>
         </w:rPr>
@@ -10387,7 +9522,7 @@
                     <pic:cNvPicPr/>
                   </pic:nvPicPr>
                   <pic:blipFill>
-                    <a:blip r:embed="rId14"/>
+                    <a:blip r:embed="rId15"/>
                     <a:stretch>
                       <a:fillRect/>
                     </a:stretch>
@@ -10436,6 +9571,7 @@
       <w:r>
         <w:rPr>
           <w:rFonts w:ascii="Times New Roman" w:hAnsi="Times New Roman" w:cs="Times New Roman"/>
+          <w:noProof/>
           <w:sz w:val="26"/>
           <w:szCs w:val="26"/>
         </w:rPr>
@@ -10456,7 +9592,7 @@
                     <pic:cNvPicPr/>
                   </pic:nvPicPr>
                   <pic:blipFill>
-                    <a:blip r:embed="rId15"/>
+                    <a:blip r:embed="rId16"/>
                     <a:stretch>
                       <a:fillRect/>
                     </a:stretch>
@@ -10554,6 +9690,7 @@
       <w:r>
         <w:rPr>
           <w:rFonts w:ascii="Times New Roman" w:hAnsi="Times New Roman" w:cs="Times New Roman"/>
+          <w:noProof/>
           <w:sz w:val="26"/>
           <w:szCs w:val="26"/>
         </w:rPr>
@@ -10573,7 +9710,7 @@
                     <pic:cNvPicPr/>
                   </pic:nvPicPr>
                   <pic:blipFill>
-                    <a:blip r:embed="rId16"/>
+                    <a:blip r:embed="rId17"/>
                     <a:stretch>
                       <a:fillRect/>
                     </a:stretch>
@@ -10645,6 +9782,7 @@
       <w:r>
         <w:rPr>
           <w:rFonts w:ascii="Times New Roman" w:hAnsi="Times New Roman" w:cs="Times New Roman"/>
+          <w:noProof/>
           <w:sz w:val="26"/>
           <w:szCs w:val="26"/>
         </w:rPr>
@@ -10664,7 +9802,7 @@
                     <pic:cNvPicPr/>
                   </pic:nvPicPr>
                   <pic:blipFill>
-                    <a:blip r:embed="rId17"/>
+                    <a:blip r:embed="rId18"/>
                     <a:stretch>
                       <a:fillRect/>
                     </a:stretch>
@@ -10696,6 +9834,7 @@
       <w:r>
         <w:rPr>
           <w:rFonts w:ascii="Times New Roman" w:hAnsi="Times New Roman" w:cs="Times New Roman"/>
+          <w:noProof/>
           <w:sz w:val="26"/>
           <w:szCs w:val="26"/>
         </w:rPr>
@@ -10715,7 +9854,7 @@
                     <pic:cNvPicPr/>
                   </pic:nvPicPr>
                   <pic:blipFill>
-                    <a:blip r:embed="rId18"/>
+                    <a:blip r:embed="rId19"/>
                     <a:stretch>
                       <a:fillRect/>
                     </a:stretch>
@@ -10747,6 +9886,7 @@
       <w:r>
         <w:rPr>
           <w:rFonts w:ascii="Times New Roman" w:hAnsi="Times New Roman" w:cs="Times New Roman"/>
+          <w:noProof/>
           <w:sz w:val="26"/>
           <w:szCs w:val="26"/>
         </w:rPr>
@@ -10766,7 +9906,7 @@
                     <pic:cNvPicPr/>
                   </pic:nvPicPr>
                   <pic:blipFill>
-                    <a:blip r:embed="rId19"/>
+                    <a:blip r:embed="rId20"/>
                     <a:stretch>
                       <a:fillRect/>
                     </a:stretch>
@@ -10897,6 +10037,7 @@
       <w:r>
         <w:rPr>
           <w:rFonts w:ascii="Times New Roman" w:hAnsi="Times New Roman" w:cs="Times New Roman"/>
+          <w:noProof/>
           <w:sz w:val="26"/>
           <w:szCs w:val="26"/>
         </w:rPr>
@@ -10916,7 +10057,7 @@
                     <pic:cNvPicPr/>
                   </pic:nvPicPr>
                   <pic:blipFill>
-                    <a:blip r:embed="rId20"/>
+                    <a:blip r:embed="rId21"/>
                     <a:stretch>
                       <a:fillRect/>
                     </a:stretch>
@@ -10948,6 +10089,7 @@
       <w:r>
         <w:rPr>
           <w:rFonts w:ascii="Times New Roman" w:hAnsi="Times New Roman" w:cs="Times New Roman"/>
+          <w:noProof/>
           <w:sz w:val="26"/>
           <w:szCs w:val="26"/>
         </w:rPr>
@@ -10967,7 +10109,7 @@
                     <pic:cNvPicPr/>
                   </pic:nvPicPr>
                   <pic:blipFill>
-                    <a:blip r:embed="rId21"/>
+                    <a:blip r:embed="rId22"/>
                     <a:stretch>
                       <a:fillRect/>
                     </a:stretch>
@@ -12215,23 +11357,7 @@
           <w:sz w:val="26"/>
           <w:szCs w:val="26"/>
         </w:rPr>
-        <w:t xml:space="preserve">A </w:t>
-      </w:r>
-      <w:r>
-        <w:rPr>
-          <w:rFonts w:ascii="Times New Roman" w:hAnsi="Times New Roman" w:cs="Times New Roman"/>
-          <w:sz w:val="26"/>
-          <w:szCs w:val="26"/>
-        </w:rPr>
-        <w:t>continuación,</w:t>
-      </w:r>
-      <w:r>
-        <w:rPr>
-          <w:rFonts w:ascii="Times New Roman" w:hAnsi="Times New Roman" w:cs="Times New Roman"/>
-          <w:sz w:val="26"/>
-          <w:szCs w:val="26"/>
-        </w:rPr>
-        <w:t xml:space="preserve"> se presentan las sugerencias derivadas de los 48 casos</w:t>
+        <w:t>A continuación, se presentan las sugerencias derivadas de los 48 casos</w:t>
       </w:r>
       <w:r>
         <w:rPr>
@@ -15572,6 +14698,7 @@
   <w:style w:type="character" w:default="1" w:styleId="Fuentedeprrafopredeter">
     <w:name w:val="Default Paragraph Font"/>
     <w:uiPriority w:val="1"/>
+    <w:semiHidden/>
     <w:unhideWhenUsed/>
   </w:style>
   <w:style w:type="table" w:default="1" w:styleId="Tablanormal">
@@ -15885,6 +15012,41 @@
       <w:spacing w:val="5"/>
     </w:rPr>
   </w:style>
+  <w:style w:type="character" w:styleId="Hipervnculo">
+    <w:name w:val="Hyperlink"/>
+    <w:basedOn w:val="Fuentedeprrafopredeter"/>
+    <w:uiPriority w:val="99"/>
+    <w:unhideWhenUsed/>
+    <w:rsid w:val="005228F3"/>
+    <w:rPr>
+      <w:color w:val="467886" w:themeColor="hyperlink"/>
+      <w:u w:val="single"/>
+    </w:rPr>
+  </w:style>
+  <w:style w:type="character" w:styleId="Mencinsinresolver">
+    <w:name w:val="Unresolved Mention"/>
+    <w:basedOn w:val="Fuentedeprrafopredeter"/>
+    <w:uiPriority w:val="99"/>
+    <w:semiHidden/>
+    <w:unhideWhenUsed/>
+    <w:rsid w:val="005228F3"/>
+    <w:rPr>
+      <w:color w:val="605E5C"/>
+      <w:shd w:val="clear" w:color="auto" w:fill="E1DFDD"/>
+    </w:rPr>
+  </w:style>
+  <w:style w:type="character" w:styleId="Hipervnculovisitado">
+    <w:name w:val="FollowedHyperlink"/>
+    <w:basedOn w:val="Fuentedeprrafopredeter"/>
+    <w:uiPriority w:val="99"/>
+    <w:semiHidden/>
+    <w:unhideWhenUsed/>
+    <w:rsid w:val="005228F3"/>
+    <w:rPr>
+      <w:color w:val="96607D" w:themeColor="followedHyperlink"/>
+      <w:u w:val="single"/>
+    </w:rPr>
+  </w:style>
 </w:styles>
 </file>
 

</xml_diff>